<commit_message>
[Update] More resource material to study on
</commit_message>
<xml_diff>
--- a/research_project/writer/PAPER.docx
+++ b/research_project/writer/PAPER.docx
@@ -7377,6 +7377,624 @@
         <w:t xml:space="preserve">allowed RQ2 title extraction to succeed).</w:t>
       </w:r>
     </w:p>
+    <w:p>
+      <w:pPr>
+        <w:pStyle w:val="BodyText"/>
+      </w:pPr>
+      <w:r>
+        <w:rPr>
+          <w:b/>
+          <w:bCs/>
+        </w:rPr>
+        <w:t xml:space="preserve">Cross-method comparison, same input (4LV/RetailOnboardPro sample).</w:t>
+      </w:r>
+      <w:r>
+        <w:t xml:space="preserve"> </w:t>
+      </w:r>
+      <w:r>
+        <w:t xml:space="preserve">Figures F1–F2 plot IntelliTest</w:t>
+      </w:r>
+      <w:r>
+        <w:t xml:space="preserve"> </w:t>
+      </w:r>
+      <w:r>
+        <w:t xml:space="preserve">(flash, pro) directly against all three baselines on the identical 4LV sample, using each method’s own</w:t>
+      </w:r>
+      <w:r>
+        <w:t xml:space="preserve"> </w:t>
+      </w:r>
+      <w:r>
+        <w:t xml:space="preserve">per-call billing log (not an estimate):</w:t>
+      </w:r>
+    </w:p>
+    <w:tbl>
+      <w:tblPr>
+        <w:tblStyle w:val="Table"/>
+        <w:tblW w:type="auto" w:w="0"/>
+        <w:tblLook w:firstRow="1" w:lastRow="0" w:firstColumn="0" w:lastColumn="0" w:noHBand="0" w:noVBand="0" w:val="0020"/>
+      </w:tblPr>
+      <w:tblGrid>
+        <w:gridCol w:w="1584"/>
+        <w:gridCol w:w="1584"/>
+        <w:gridCol w:w="1584"/>
+        <w:gridCol w:w="1584"/>
+        <w:gridCol w:w="1584"/>
+      </w:tblGrid>
+      <w:tr>
+        <w:trPr>
+          <w:tblHeader w:val="on"/>
+        </w:trPr>
+        <w:tc>
+          <w:tcPr/>
+          <w:p>
+            <w:pPr>
+              <w:pStyle w:val="Compact"/>
+            </w:pPr>
+            <w:r>
+              <w:t xml:space="preserve">Method</w:t>
+            </w:r>
+          </w:p>
+        </w:tc>
+        <w:tc>
+          <w:tcPr/>
+          <w:p>
+            <w:pPr>
+              <w:pStyle w:val="Compact"/>
+              <w:jc w:val="right"/>
+            </w:pPr>
+            <w:r>
+              <w:t xml:space="preserve">Total tokens</w:t>
+            </w:r>
+          </w:p>
+        </w:tc>
+        <w:tc>
+          <w:tcPr/>
+          <w:p>
+            <w:pPr>
+              <w:pStyle w:val="Compact"/>
+              <w:jc w:val="right"/>
+            </w:pPr>
+            <w:r>
+              <w:t xml:space="preserve">Cost</w:t>
+            </w:r>
+          </w:p>
+        </w:tc>
+        <w:tc>
+          <w:tcPr/>
+          <w:p>
+            <w:pPr>
+              <w:pStyle w:val="Compact"/>
+              <w:jc w:val="right"/>
+            </w:pPr>
+            <w:r>
+              <w:t xml:space="preserve">Calls</w:t>
+            </w:r>
+          </w:p>
+        </w:tc>
+        <w:tc>
+          <w:tcPr/>
+          <w:p>
+            <w:pPr>
+              <w:pStyle w:val="Compact"/>
+              <w:jc w:val="right"/>
+            </w:pPr>
+            <w:r>
+              <w:t xml:space="preserve">Avg. tokens/call</w:t>
+            </w:r>
+          </w:p>
+        </w:tc>
+      </w:tr>
+      <w:tr>
+        <w:tc>
+          <w:tcPr/>
+          <w:p>
+            <w:pPr>
+              <w:pStyle w:val="Compact"/>
+            </w:pPr>
+            <w:r>
+              <w:t xml:space="preserve">IntelliTest (flash)</w:t>
+            </w:r>
+          </w:p>
+        </w:tc>
+        <w:tc>
+          <w:tcPr/>
+          <w:p>
+            <w:pPr>
+              <w:pStyle w:val="Compact"/>
+              <w:jc w:val="right"/>
+            </w:pPr>
+            <w:r>
+              <w:t xml:space="preserve">429,097</w:t>
+            </w:r>
+          </w:p>
+        </w:tc>
+        <w:tc>
+          <w:tcPr/>
+          <w:p>
+            <w:pPr>
+              <w:pStyle w:val="Compact"/>
+              <w:jc w:val="right"/>
+            </w:pPr>
+            <w:r>
+              <w:t xml:space="preserve">$0.167</w:t>
+            </w:r>
+          </w:p>
+        </w:tc>
+        <w:tc>
+          <w:tcPr/>
+          <w:p>
+            <w:pPr>
+              <w:pStyle w:val="Compact"/>
+              <w:jc w:val="right"/>
+            </w:pPr>
+            <w:r>
+              <w:t xml:space="preserve">40</w:t>
+            </w:r>
+          </w:p>
+        </w:tc>
+        <w:tc>
+          <w:tcPr/>
+          <w:p>
+            <w:pPr>
+              <w:pStyle w:val="Compact"/>
+              <w:jc w:val="right"/>
+            </w:pPr>
+            <w:r>
+              <w:t xml:space="preserve">10,727</w:t>
+            </w:r>
+          </w:p>
+        </w:tc>
+      </w:tr>
+      <w:tr>
+        <w:tc>
+          <w:tcPr/>
+          <w:p>
+            <w:pPr>
+              <w:pStyle w:val="Compact"/>
+            </w:pPr>
+            <w:r>
+              <w:t xml:space="preserve">IntelliTest (pro)</w:t>
+            </w:r>
+          </w:p>
+        </w:tc>
+        <w:tc>
+          <w:tcPr/>
+          <w:p>
+            <w:pPr>
+              <w:pStyle w:val="Compact"/>
+              <w:jc w:val="right"/>
+            </w:pPr>
+            <w:r>
+              <w:t xml:space="preserve">66,774</w:t>
+            </w:r>
+          </w:p>
+        </w:tc>
+        <w:tc>
+          <w:tcPr/>
+          <w:p>
+            <w:pPr>
+              <w:pStyle w:val="Compact"/>
+              <w:jc w:val="right"/>
+            </w:pPr>
+            <w:r>
+              <w:t xml:space="preserve">$0.090</w:t>
+            </w:r>
+          </w:p>
+        </w:tc>
+        <w:tc>
+          <w:tcPr/>
+          <w:p>
+            <w:pPr>
+              <w:pStyle w:val="Compact"/>
+              <w:jc w:val="right"/>
+            </w:pPr>
+            <w:r>
+              <w:t xml:space="preserve">10</w:t>
+            </w:r>
+          </w:p>
+        </w:tc>
+        <w:tc>
+          <w:tcPr/>
+          <w:p>
+            <w:pPr>
+              <w:pStyle w:val="Compact"/>
+              <w:jc w:val="right"/>
+            </w:pPr>
+            <w:r>
+              <w:t xml:space="preserve">6,677</w:t>
+            </w:r>
+          </w:p>
+        </w:tc>
+      </w:tr>
+      <w:tr>
+        <w:tc>
+          <w:tcPr/>
+          <w:p>
+            <w:pPr>
+              <w:pStyle w:val="Compact"/>
+            </w:pPr>
+            <w:r>
+              <w:t xml:space="preserve">Baseline 1 (Augusto)</w:t>
+            </w:r>
+          </w:p>
+        </w:tc>
+        <w:tc>
+          <w:tcPr/>
+          <w:p>
+            <w:pPr>
+              <w:pStyle w:val="Compact"/>
+              <w:jc w:val="right"/>
+            </w:pPr>
+            <w:r>
+              <w:rPr>
+                <w:b/>
+                <w:bCs/>
+              </w:rPr>
+              <w:t xml:space="preserve">569,337</w:t>
+            </w:r>
+          </w:p>
+        </w:tc>
+        <w:tc>
+          <w:tcPr/>
+          <w:p>
+            <w:pPr>
+              <w:pStyle w:val="Compact"/>
+              <w:jc w:val="right"/>
+            </w:pPr>
+            <w:r>
+              <w:rPr>
+                <w:b/>
+                <w:bCs/>
+              </w:rPr>
+              <w:t xml:space="preserve">$1.090</w:t>
+            </w:r>
+          </w:p>
+        </w:tc>
+        <w:tc>
+          <w:tcPr/>
+          <w:p>
+            <w:pPr>
+              <w:pStyle w:val="Compact"/>
+              <w:jc w:val="right"/>
+            </w:pPr>
+            <w:r>
+              <w:t xml:space="preserve">27</w:t>
+            </w:r>
+          </w:p>
+        </w:tc>
+        <w:tc>
+          <w:tcPr/>
+          <w:p>
+            <w:pPr>
+              <w:pStyle w:val="Compact"/>
+              <w:jc w:val="right"/>
+            </w:pPr>
+            <w:r>
+              <w:rPr>
+                <w:b/>
+                <w:bCs/>
+              </w:rPr>
+              <w:t xml:space="preserve">21,087</w:t>
+            </w:r>
+          </w:p>
+        </w:tc>
+      </w:tr>
+      <w:tr>
+        <w:tc>
+          <w:tcPr/>
+          <w:p>
+            <w:pPr>
+              <w:pStyle w:val="Compact"/>
+            </w:pPr>
+            <w:r>
+              <w:t xml:space="preserve">Baseline 2 (Milchevski)</w:t>
+            </w:r>
+          </w:p>
+        </w:tc>
+        <w:tc>
+          <w:tcPr/>
+          <w:p>
+            <w:pPr>
+              <w:pStyle w:val="Compact"/>
+              <w:jc w:val="right"/>
+            </w:pPr>
+            <w:r>
+              <w:t xml:space="preserve">131,072</w:t>
+            </w:r>
+          </w:p>
+        </w:tc>
+        <w:tc>
+          <w:tcPr/>
+          <w:p>
+            <w:pPr>
+              <w:pStyle w:val="Compact"/>
+              <w:jc w:val="right"/>
+            </w:pPr>
+            <w:r>
+              <w:t xml:space="preserve">$0.282</w:t>
+            </w:r>
+          </w:p>
+        </w:tc>
+        <w:tc>
+          <w:tcPr/>
+          <w:p>
+            <w:pPr>
+              <w:pStyle w:val="Compact"/>
+              <w:jc w:val="right"/>
+            </w:pPr>
+            <w:r>
+              <w:t xml:space="preserve">28</w:t>
+            </w:r>
+          </w:p>
+        </w:tc>
+        <w:tc>
+          <w:tcPr/>
+          <w:p>
+            <w:pPr>
+              <w:pStyle w:val="Compact"/>
+              <w:jc w:val="right"/>
+            </w:pPr>
+            <w:r>
+              <w:t xml:space="preserve">4,681</w:t>
+            </w:r>
+          </w:p>
+        </w:tc>
+      </w:tr>
+      <w:tr>
+        <w:tc>
+          <w:tcPr/>
+          <w:p>
+            <w:pPr>
+              <w:pStyle w:val="Compact"/>
+            </w:pPr>
+            <w:r>
+              <w:t xml:space="preserve">Baseline 3 (Bhatia)</w:t>
+            </w:r>
+          </w:p>
+        </w:tc>
+        <w:tc>
+          <w:tcPr/>
+          <w:p>
+            <w:pPr>
+              <w:pStyle w:val="Compact"/>
+              <w:jc w:val="right"/>
+            </w:pPr>
+            <w:r>
+              <w:t xml:space="preserve">10,858</w:t>
+            </w:r>
+          </w:p>
+        </w:tc>
+        <w:tc>
+          <w:tcPr/>
+          <w:p>
+            <w:pPr>
+              <w:pStyle w:val="Compact"/>
+              <w:jc w:val="right"/>
+            </w:pPr>
+            <w:r>
+              <w:t xml:space="preserve">$0.019</w:t>
+            </w:r>
+          </w:p>
+        </w:tc>
+        <w:tc>
+          <w:tcPr/>
+          <w:p>
+            <w:pPr>
+              <w:pStyle w:val="Compact"/>
+              <w:jc w:val="right"/>
+            </w:pPr>
+            <w:r>
+              <w:t xml:space="preserve">3</w:t>
+            </w:r>
+          </w:p>
+        </w:tc>
+        <w:tc>
+          <w:tcPr/>
+          <w:p>
+            <w:pPr>
+              <w:pStyle w:val="Compact"/>
+              <w:jc w:val="right"/>
+            </w:pPr>
+            <w:r>
+              <w:t xml:space="preserve">3,619</w:t>
+            </w:r>
+          </w:p>
+        </w:tc>
+      </w:tr>
+    </w:tbl>
+    <w:p>
+      <w:pPr>
+        <w:pStyle w:val="BodyText"/>
+      </w:pPr>
+      <w:r>
+        <w:t xml:space="preserve">Three observations follow directly from this comparison (Figure F1, F2):</w:t>
+      </w:r>
+    </w:p>
+    <w:p>
+      <w:pPr>
+        <w:pStyle w:val="Compact"/>
+        <w:numPr>
+          <w:ilvl w:val="0"/>
+          <w:numId w:val="1007"/>
+        </w:numPr>
+      </w:pPr>
+      <w:r>
+        <w:rPr>
+          <w:b/>
+          <w:bCs/>
+        </w:rPr>
+        <w:t xml:space="preserve">Baseline 1 (Augusto) is the most expensive method on this input</w:t>
+      </w:r>
+      <w:r>
+        <w:t xml:space="preserve"> </w:t>
+      </w:r>
+      <w:r>
+        <w:t xml:space="preserve">— 569,337 tokens / $1.09, more than</w:t>
+      </w:r>
+      <w:r>
+        <w:t xml:space="preserve"> </w:t>
+      </w:r>
+      <w:r>
+        <w:t xml:space="preserve">any IntelliTest configuration, driven by its highest average tokens-per-call (21,087): its Few-Shot+CoT</w:t>
+      </w:r>
+      <w:r>
+        <w:t xml:space="preserve"> </w:t>
+      </w:r>
+      <w:r>
+        <w:t xml:space="preserve">prompts embed the full example test-case bank on every RQ2 call (leave-one-out cross-validation resends a</w:t>
+      </w:r>
+      <w:r>
+        <w:t xml:space="preserve"> </w:t>
+      </w:r>
+      <w:r>
+        <w:t xml:space="preserve">large example set each time), which is expensive but is also</w:t>
+      </w:r>
+      <w:r>
+        <w:t xml:space="preserve"> </w:t>
+      </w:r>
+      <w:r>
+        <w:rPr>
+          <w:i/>
+          <w:iCs/>
+        </w:rPr>
+        <w:t xml:space="preserve">by design</w:t>
+      </w:r>
+      <w:r>
+        <w:t xml:space="preserve"> </w:t>
+      </w:r>
+      <w:r>
+        <w:t xml:space="preserve">(verbatim to the original method).</w:t>
+      </w:r>
+    </w:p>
+    <w:p>
+      <w:pPr>
+        <w:pStyle w:val="Compact"/>
+        <w:numPr>
+          <w:ilvl w:val="0"/>
+          <w:numId w:val="1007"/>
+        </w:numPr>
+      </w:pPr>
+      <w:r>
+        <w:rPr>
+          <w:b/>
+          <w:bCs/>
+        </w:rPr>
+        <w:t xml:space="preserve">Baseline 3 (Bhatia) is by far the cheapest</w:t>
+      </w:r>
+      <w:r>
+        <w:t xml:space="preserve"> </w:t>
+      </w:r>
+      <w:r>
+        <w:t xml:space="preserve">(10,858 tokens / $0.019, only 3 calls) because its</w:t>
+      </w:r>
+      <w:r>
+        <w:t xml:space="preserve"> </w:t>
+      </w:r>
+      <w:r>
+        <w:t xml:space="preserve">conversational design amortizes the SRS across a single chat session and asks for all test cases per use</w:t>
+      </w:r>
+      <w:r>
+        <w:t xml:space="preserve"> </w:t>
+      </w:r>
+      <w:r>
+        <w:t xml:space="preserve">case in one shot — but the fidelity audit (§IV-A baselines) shows this comes at the cost of shallower,</w:t>
+      </w:r>
+      <w:r>
+        <w:t xml:space="preserve"> </w:t>
+      </w:r>
+      <w:r>
+        <w:t xml:space="preserve">less-structured output (a flat 6-column Markdown table, no BVA/Pairwise optimization, no navigational</w:t>
+      </w:r>
+      <w:r>
+        <w:t xml:space="preserve"> </w:t>
+      </w:r>
+      <w:r>
+        <w:t xml:space="preserve">grounding) compared with IntelliTest’s ISO-style, stateful output.</w:t>
+      </w:r>
+    </w:p>
+    <w:p>
+      <w:pPr>
+        <w:pStyle w:val="Compact"/>
+        <w:numPr>
+          <w:ilvl w:val="0"/>
+          <w:numId w:val="1007"/>
+        </w:numPr>
+      </w:pPr>
+      <w:r>
+        <w:rPr>
+          <w:b/>
+          <w:bCs/>
+        </w:rPr>
+        <w:t xml:space="preserve">IntelliTest’s own model choice matters more than the choice of baseline vs. IntelliTest</w:t>
+      </w:r>
+      <w:r>
+        <w:t xml:space="preserve">: pro</w:t>
+      </w:r>
+      <w:r>
+        <w:t xml:space="preserve"> </w:t>
+      </w:r>
+      <w:r>
+        <w:t xml:space="preserve">(66,774 tokens) is cheaper on this small input than every baseline except Bhatia, while flash</w:t>
+      </w:r>
+      <w:r>
+        <w:t xml:space="preserve"> </w:t>
+      </w:r>
+      <w:r>
+        <w:t xml:space="preserve">(429,097 tokens) sits between Milchevski and Augusto. This says less about</w:t>
+      </w:r>
+      <w:r>
+        <w:t xml:space="preserve"> </w:t>
+      </w:r>
+      <w:r>
+        <w:t xml:space="preserve">“IntelliTest vs. baselines”</w:t>
+      </w:r>
+      <w:r>
+        <w:t xml:space="preserve"> </w:t>
+      </w:r>
+      <w:r>
+        <w:t xml:space="preserve">in the abstract and more about</w:t>
+      </w:r>
+      <w:r>
+        <w:t xml:space="preserve"> </w:t>
+      </w:r>
+      <w:r>
+        <w:t xml:space="preserve">“cost scales with how much structure and cross-validation a method</w:t>
+      </w:r>
+      <w:r>
+        <w:t xml:space="preserve"> </w:t>
+      </w:r>
+      <w:r>
+        <w:t xml:space="preserve">builds into every call”</w:t>
+      </w:r>
+      <w:r>
+        <w:t xml:space="preserve"> </w:t>
+      </w:r>
+      <w:r>
+        <w:t xml:space="preserve">— the deterministic algorithms IntelliTest layers on top of the LLM (EP, BVA,</w:t>
+      </w:r>
+      <w:r>
+        <w:t xml:space="preserve"> </w:t>
+      </w:r>
+      <w:r>
+        <w:t xml:space="preserve">Pairwise) are cheap; what varies is how verbose each method’s</w:t>
+      </w:r>
+      <w:r>
+        <w:t xml:space="preserve"> </w:t>
+      </w:r>
+      <w:r>
+        <w:rPr>
+          <w:i/>
+          <w:iCs/>
+        </w:rPr>
+        <w:t xml:space="preserve">prompting strategy</w:t>
+      </w:r>
+      <w:r>
+        <w:t xml:space="preserve"> </w:t>
+      </w:r>
+      <w:r>
+        <w:t xml:space="preserve">is per call.</w:t>
+      </w:r>
+    </w:p>
     <w:bookmarkEnd w:id="25"/>
     <w:bookmarkStart w:id="26" w:name="X601e5e94a472e19a079fad749e52c60c320cee6"/>
     <w:p>
@@ -8403,6 +9021,557 @@
       </w:r>
     </w:p>
     <w:p>
+      <w:pPr>
+        <w:pStyle w:val="BodyText"/>
+      </w:pPr>
+      <w:r>
+        <w:rPr>
+          <w:b/>
+          <w:bCs/>
+        </w:rPr>
+        <w:t xml:space="preserve">Head-to-head, same SUT: agentic TEAA vs. static-script baseline (Figures F5–F6).</w:t>
+      </w:r>
+      <w:r>
+        <w:t xml:space="preserve"> </w:t>
+      </w:r>
+      <w:r>
+        <w:t xml:space="preserve">Directly comparing the</w:t>
+      </w:r>
+      <w:r>
+        <w:t xml:space="preserve"> </w:t>
+      </w:r>
+      <w:r>
+        <w:t xml:space="preserve">two execution paradigms on the same live FullTeaching SUT:</w:t>
+      </w:r>
+    </w:p>
+    <w:tbl>
+      <w:tblPr>
+        <w:tblStyle w:val="Table"/>
+        <w:tblW w:type="auto" w:w="0"/>
+        <w:tblLook w:firstRow="1" w:lastRow="0" w:firstColumn="0" w:lastColumn="0" w:noHBand="0" w:noVBand="0" w:val="0020"/>
+      </w:tblPr>
+      <w:tblGrid>
+        <w:gridCol w:w="1980"/>
+        <w:gridCol w:w="1980"/>
+        <w:gridCol w:w="1980"/>
+        <w:gridCol w:w="1980"/>
+      </w:tblGrid>
+      <w:tr>
+        <w:trPr>
+          <w:tblHeader w:val="on"/>
+        </w:trPr>
+        <w:tc>
+          <w:tcPr/>
+          <w:p>
+            <w:pPr>
+              <w:pStyle w:val="Compact"/>
+            </w:pPr>
+            <w:r>
+              <w:t xml:space="preserve">Paradigm</w:t>
+            </w:r>
+          </w:p>
+        </w:tc>
+        <w:tc>
+          <w:tcPr/>
+          <w:p>
+            <w:pPr>
+              <w:pStyle w:val="Compact"/>
+              <w:jc w:val="right"/>
+            </w:pPr>
+            <w:r>
+              <w:t xml:space="preserve">N</w:t>
+            </w:r>
+          </w:p>
+        </w:tc>
+        <w:tc>
+          <w:tcPr/>
+          <w:p>
+            <w:pPr>
+              <w:pStyle w:val="Compact"/>
+              <w:jc w:val="right"/>
+            </w:pPr>
+            <w:r>
+              <w:t xml:space="preserve">Passed</w:t>
+            </w:r>
+          </w:p>
+        </w:tc>
+        <w:tc>
+          <w:tcPr/>
+          <w:p>
+            <w:pPr>
+              <w:pStyle w:val="Compact"/>
+              <w:jc w:val="right"/>
+            </w:pPr>
+            <w:r>
+              <w:t xml:space="preserve">Success rate</w:t>
+            </w:r>
+          </w:p>
+        </w:tc>
+      </w:tr>
+      <w:tr>
+        <w:tc>
+          <w:tcPr/>
+          <w:p>
+            <w:pPr>
+              <w:pStyle w:val="Compact"/>
+            </w:pPr>
+            <w:r>
+              <w:rPr>
+                <w:b/>
+                <w:bCs/>
+              </w:rPr>
+              <w:t xml:space="preserve">TEAA agent</w:t>
+            </w:r>
+            <w:r>
+              <w:t xml:space="preserve"> </w:t>
+            </w:r>
+            <w:r>
+              <w:t xml:space="preserve">(agentic, self-healing)</w:t>
+            </w:r>
+          </w:p>
+        </w:tc>
+        <w:tc>
+          <w:tcPr/>
+          <w:p>
+            <w:pPr>
+              <w:pStyle w:val="Compact"/>
+              <w:jc w:val="right"/>
+            </w:pPr>
+            <w:r>
+              <w:t xml:space="preserve">166</w:t>
+            </w:r>
+          </w:p>
+        </w:tc>
+        <w:tc>
+          <w:tcPr/>
+          <w:p>
+            <w:pPr>
+              <w:pStyle w:val="Compact"/>
+              <w:jc w:val="right"/>
+            </w:pPr>
+            <w:r>
+              <w:t xml:space="preserve">70</w:t>
+            </w:r>
+          </w:p>
+        </w:tc>
+        <w:tc>
+          <w:tcPr/>
+          <w:p>
+            <w:pPr>
+              <w:pStyle w:val="Compact"/>
+              <w:jc w:val="right"/>
+            </w:pPr>
+            <w:r>
+              <w:rPr>
+                <w:b/>
+                <w:bCs/>
+              </w:rPr>
+              <w:t xml:space="preserve">42.2%</w:t>
+            </w:r>
+          </w:p>
+        </w:tc>
+      </w:tr>
+      <w:tr>
+        <w:tc>
+          <w:tcPr/>
+          <w:p>
+            <w:pPr>
+              <w:pStyle w:val="Compact"/>
+            </w:pPr>
+            <w:r>
+              <w:rPr>
+                <w:b/>
+                <w:bCs/>
+              </w:rPr>
+              <w:t xml:space="preserve">Static script</w:t>
+            </w:r>
+            <w:r>
+              <w:t xml:space="preserve"> </w:t>
+            </w:r>
+            <w:r>
+              <w:t xml:space="preserve">(Cypress/AutoUAT-style)</w:t>
+            </w:r>
+          </w:p>
+        </w:tc>
+        <w:tc>
+          <w:tcPr/>
+          <w:p>
+            <w:pPr>
+              <w:pStyle w:val="Compact"/>
+              <w:jc w:val="right"/>
+            </w:pPr>
+            <w:r>
+              <w:t xml:space="preserve">169</w:t>
+            </w:r>
+          </w:p>
+        </w:tc>
+        <w:tc>
+          <w:tcPr/>
+          <w:p>
+            <w:pPr>
+              <w:pStyle w:val="Compact"/>
+              <w:jc w:val="right"/>
+            </w:pPr>
+            <w:r>
+              <w:t xml:space="preserve">26</w:t>
+            </w:r>
+          </w:p>
+        </w:tc>
+        <w:tc>
+          <w:tcPr/>
+          <w:p>
+            <w:pPr>
+              <w:pStyle w:val="Compact"/>
+              <w:jc w:val="right"/>
+            </w:pPr>
+            <w:r>
+              <w:rPr>
+                <w:b/>
+                <w:bCs/>
+              </w:rPr>
+              <w:t xml:space="preserve">15.4%</w:t>
+            </w:r>
+          </w:p>
+        </w:tc>
+      </w:tr>
+    </w:tbl>
+    <w:p>
+      <w:pPr>
+        <w:pStyle w:val="BodyText"/>
+      </w:pPr>
+      <w:r>
+        <w:t xml:space="preserve">The agentic approach passes</w:t>
+      </w:r>
+      <w:r>
+        <w:t xml:space="preserve"> </w:t>
+      </w:r>
+      <w:r>
+        <w:rPr>
+          <w:b/>
+          <w:bCs/>
+        </w:rPr>
+        <w:t xml:space="preserve">~2.7× the proportion</w:t>
+      </w:r>
+      <w:r>
+        <w:t xml:space="preserve"> </w:t>
+      </w:r>
+      <w:r>
+        <w:t xml:space="preserve">of test cases that the static-script baseline does on</w:t>
+      </w:r>
+      <w:r>
+        <w:t xml:space="preserve"> </w:t>
+      </w:r>
+      <w:r>
+        <w:t xml:space="preserve">a comparably-sized suite. The</w:t>
+      </w:r>
+      <w:r>
+        <w:t xml:space="preserve"> </w:t>
+      </w:r>
+      <w:r>
+        <w:rPr>
+          <w:i/>
+          <w:iCs/>
+        </w:rPr>
+        <w:t xml:space="preserve">reason</w:t>
+      </w:r>
+      <w:r>
+        <w:t xml:space="preserve"> </w:t>
+      </w:r>
+      <w:r>
+        <w:t xml:space="preserve">differs sharply between paradigms (Figure F6): the static script’s</w:t>
+      </w:r>
+      <w:r>
+        <w:t xml:space="preserve"> </w:t>
+      </w:r>
+      <w:r>
+        <w:t xml:space="preserve">failures are overwhelmingly (78%, 132/169) plain</w:t>
+      </w:r>
+      <w:r>
+        <w:t xml:space="preserve"> </w:t>
+      </w:r>
+      <w:r>
+        <w:rPr>
+          <w:b/>
+          <w:bCs/>
+        </w:rPr>
+        <w:t xml:space="preserve">Failed</w:t>
+      </w:r>
+      <w:r>
+        <w:t xml:space="preserve"> </w:t>
+      </w:r>
+      <w:r>
+        <w:t xml:space="preserve">outcomes attributable to brittle selectors and</w:t>
+      </w:r>
+      <w:r>
+        <w:t xml:space="preserve"> </w:t>
+      </w:r>
+      <w:r>
+        <w:t xml:space="preserve">timing/race conditions against a dynamic Angular UI, with no mechanism to recover once a selector goes stale.</w:t>
+      </w:r>
+      <w:r>
+        <w:t xml:space="preserve"> </w:t>
+      </w:r>
+      <w:r>
+        <w:t xml:space="preserve">The TEAA agent’s failures split into</w:t>
+      </w:r>
+      <w:r>
+        <w:t xml:space="preserve"> </w:t>
+      </w:r>
+      <w:r>
+        <w:rPr>
+          <w:b/>
+          <w:bCs/>
+        </w:rPr>
+        <w:t xml:space="preserve">Web/DOM failures (37%, 61/96)</w:t>
+      </w:r>
+      <w:r>
+        <w:t xml:space="preserve"> </w:t>
+      </w:r>
+      <w:r>
+        <w:t xml:space="preserve">— the same class of brittleness, but</w:t>
+      </w:r>
+      <w:r>
+        <w:t xml:space="preserve"> </w:t>
+      </w:r>
+      <w:r>
+        <w:t xml:space="preserve">partially mitigated by DOM re-abstraction on each step — and</w:t>
+      </w:r>
+      <w:r>
+        <w:t xml:space="preserve"> </w:t>
+      </w:r>
+      <w:r>
+        <w:rPr>
+          <w:b/>
+          <w:bCs/>
+        </w:rPr>
+        <w:t xml:space="preserve">LLM failures (21%, 35/96)</w:t>
+      </w:r>
+      <w:r>
+        <w:t xml:space="preserve">, a</w:t>
+      </w:r>
+      <w:r>
+        <w:t xml:space="preserve"> </w:t>
+      </w:r>
+      <w:r>
+        <w:rPr>
+          <w:i/>
+          <w:iCs/>
+        </w:rPr>
+        <w:t xml:space="preserve">new</w:t>
+      </w:r>
+      <w:r>
+        <w:t xml:space="preserve"> </w:t>
+      </w:r>
+      <w:r>
+        <w:t xml:space="preserve">failure</w:t>
+      </w:r>
+      <w:r>
+        <w:t xml:space="preserve"> </w:t>
+      </w:r>
+      <w:r>
+        <w:t xml:space="preserve">mode introduced by the agent’s own reasoning (e.g., choosing a plausible but non-existent element</w:t>
+      </w:r>
+      <w:r>
+        <w:t xml:space="preserve"> </w:t>
+      </w:r>
+      <w:r>
+        <w:rPr>
+          <w:rStyle w:val="VerbatimChar"/>
+        </w:rPr>
+        <w:t xml:space="preserve">id</w:t>
+      </w:r>
+      <w:r>
+        <w:t xml:space="preserve">). In</w:t>
+      </w:r>
+      <w:r>
+        <w:t xml:space="preserve"> </w:t>
+      </w:r>
+      <w:r>
+        <w:t xml:space="preserve">other words, the agentic approach trades a fraction of the static approach’s brittleness failures for a</w:t>
+      </w:r>
+      <w:r>
+        <w:t xml:space="preserve"> </w:t>
+      </w:r>
+      <w:r>
+        <w:t xml:space="preserve">smaller number of reasoning failures, and nets a substantially higher pass rate. This is the central Phase-2</w:t>
+      </w:r>
+      <w:r>
+        <w:t xml:space="preserve"> </w:t>
+      </w:r>
+      <w:r>
+        <w:t xml:space="preserve">argument for TEAA over a static-script alternative on a dynamic SUT, though it does not eliminate the</w:t>
+      </w:r>
+      <w:r>
+        <w:t xml:space="preserve"> </w:t>
+      </w:r>
+      <w:r>
+        <w:t xml:space="preserve">brittleness problem — it converts most of it into a partially self-healing form.</w:t>
+      </w:r>
+    </w:p>
+    <w:p>
+      <w:pPr>
+        <w:pStyle w:val="BodyText"/>
+      </w:pPr>
+      <w:r>
+        <w:rPr>
+          <w:b/>
+          <w:bCs/>
+        </w:rPr>
+        <w:t xml:space="preserve">Where the agent still struggles (Figure F7).</w:t>
+      </w:r>
+      <w:r>
+        <w:t xml:space="preserve"> </w:t>
+      </w:r>
+      <w:r>
+        <w:t xml:space="preserve">Breaking down TEAA’s own success rate by action type shows</w:t>
+      </w:r>
+      <w:r>
+        <w:t xml:space="preserve"> </w:t>
+      </w:r>
+      <w:r>
+        <w:t xml:space="preserve">the same brittleness surfacing internally:</w:t>
+      </w:r>
+      <w:r>
+        <w:t xml:space="preserve"> </w:t>
+      </w:r>
+      <w:r>
+        <w:rPr>
+          <w:rStyle w:val="VerbatimChar"/>
+        </w:rPr>
+        <w:t xml:space="preserve">done</w:t>
+      </w:r>
+      <w:r>
+        <w:t xml:space="preserve"> </w:t>
+      </w:r>
+      <w:r>
+        <w:t xml:space="preserve">(task self-termination) succeeds 68.8% of the time, but</w:t>
+      </w:r>
+      <w:r>
+        <w:t xml:space="preserve"> </w:t>
+      </w:r>
+      <w:r>
+        <w:rPr>
+          <w:rStyle w:val="VerbatimChar"/>
+        </w:rPr>
+        <w:t xml:space="preserve">click</w:t>
+      </w:r>
+      <w:r>
+        <w:t xml:space="preserve"> </w:t>
+      </w:r>
+      <w:r>
+        <w:t xml:space="preserve">succeeds only 33.0% and</w:t>
+      </w:r>
+      <w:r>
+        <w:t xml:space="preserve"> </w:t>
+      </w:r>
+      <w:r>
+        <w:rPr>
+          <w:rStyle w:val="VerbatimChar"/>
+        </w:rPr>
+        <w:t xml:space="preserve">input</w:t>
+      </w:r>
+      <w:r>
+        <w:t xml:space="preserve"> </w:t>
+      </w:r>
+      <w:r>
+        <w:t xml:space="preserve">only 25.7% — the two actions that require the agent to have correctly</w:t>
+      </w:r>
+      <w:r>
+        <w:t xml:space="preserve"> </w:t>
+      </w:r>
+      <w:r>
+        <w:t xml:space="preserve">identified a</w:t>
+      </w:r>
+      <w:r>
+        <w:t xml:space="preserve"> </w:t>
+      </w:r>
+      <w:r>
+        <w:rPr>
+          <w:i/>
+          <w:iCs/>
+        </w:rPr>
+        <w:t xml:space="preserve">specific</w:t>
+      </w:r>
+      <w:r>
+        <w:t xml:space="preserve"> </w:t>
+      </w:r>
+      <w:r>
+        <w:t xml:space="preserve">element via a selector it inferred from the abstracted DOM.</w:t>
+      </w:r>
+      <w:r>
+        <w:t xml:space="preserve"> </w:t>
+      </w:r>
+      <w:r>
+        <w:rPr>
+          <w:rStyle w:val="VerbatimChar"/>
+        </w:rPr>
+        <w:t xml:space="preserve">upload</w:t>
+      </w:r>
+      <w:r>
+        <w:t xml:space="preserve"> </w:t>
+      </w:r>
+      <w:r>
+        <w:t xml:space="preserve">(n=8, 50%) is</w:t>
+      </w:r>
+      <w:r>
+        <w:t xml:space="preserve"> </w:t>
+      </w:r>
+      <w:r>
+        <w:t xml:space="preserve">too small a sample to generalize. This localizes the agent’s weakness precisely: not</w:t>
+      </w:r>
+      <w:r>
+        <w:t xml:space="preserve"> </w:t>
+      </w:r>
+      <w:r>
+        <w:t xml:space="preserve">“does the agent decide</w:t>
+      </w:r>
+      <w:r>
+        <w:t xml:space="preserve"> </w:t>
+      </w:r>
+      <w:r>
+        <w:t xml:space="preserve">correctly”</w:t>
+      </w:r>
+      <w:r>
+        <w:t xml:space="preserve"> </w:t>
+      </w:r>
+      <w:r>
+        <w:t xml:space="preserve">(its</w:t>
+      </w:r>
+      <w:r>
+        <w:t xml:space="preserve"> </w:t>
+      </w:r>
+      <w:r>
+        <w:rPr>
+          <w:rStyle w:val="VerbatimChar"/>
+        </w:rPr>
+        <w:t xml:space="preserve">done</w:t>
+      </w:r>
+      <w:r>
+        <w:t xml:space="preserve"> </w:t>
+      </w:r>
+      <w:r>
+        <w:t xml:space="preserve">signal is comparatively reliable) but</w:t>
+      </w:r>
+      <w:r>
+        <w:t xml:space="preserve"> </w:t>
+      </w:r>
+      <w:r>
+        <w:t xml:space="preserve">“does the agent’s selector match the live DOM,”</w:t>
+      </w:r>
+      <w:r>
+        <w:t xml:space="preserve"> </w:t>
+      </w:r>
+      <w:r>
+        <w:t xml:space="preserve">which is exactly the self-healing/selector-repair problem the newest literature (arXiv:2603.20358,</w:t>
+      </w:r>
+      <w:r>
+        <w:t xml:space="preserve"> </w:t>
+      </w:r>
+      <w:r>
+        <w:t xml:space="preserve">arXiv:2605.01471) is now targeting.</w:t>
+      </w:r>
+    </w:p>
+    <w:p>
       <w:r>
         <w:pict>
           <v:rect style="width:0;height:1.5pt" o:hralign="center" o:hrstd="t" o:hr="t"/>
@@ -9467,7 +10636,7 @@
         <w:pStyle w:val="Compact"/>
         <w:numPr>
           <w:ilvl w:val="0"/>
-          <w:numId w:val="1007"/>
+          <w:numId w:val="1008"/>
         </w:numPr>
       </w:pPr>
       <w:r>
@@ -9485,420 +10654,6 @@
       </w:r>
       <w:r>
         <w:t xml:space="preserve">results characterize minimal-input behavior only and are not a thesis reproduction of RetailOnboardPro.</w:t>
-      </w:r>
-    </w:p>
-    <w:p>
-      <w:pPr>
-        <w:pStyle w:val="Compact"/>
-        <w:numPr>
-          <w:ilvl w:val="0"/>
-          <w:numId w:val="1007"/>
-        </w:numPr>
-      </w:pPr>
-      <w:r>
-        <w:rPr>
-          <w:b/>
-          <w:bCs/>
-        </w:rPr>
-        <w:t xml:space="preserve">Placeholder pricing.</w:t>
-      </w:r>
-      <w:r>
-        <w:t xml:space="preserve"> </w:t>
-      </w:r>
-      <w:r>
-        <w:t xml:space="preserve">All USD figures depend on unofficial per-1M rates; only token counts are ground</w:t>
-      </w:r>
-      <w:r>
-        <w:t xml:space="preserve"> </w:t>
-      </w:r>
-      <w:r>
-        <w:t xml:space="preserve">truth.</w:t>
-      </w:r>
-    </w:p>
-    <w:p>
-      <w:pPr>
-        <w:pStyle w:val="Compact"/>
-        <w:numPr>
-          <w:ilvl w:val="0"/>
-          <w:numId w:val="1007"/>
-        </w:numPr>
-      </w:pPr>
-      <w:r>
-        <w:rPr>
-          <w:b/>
-          <w:bCs/>
-        </w:rPr>
-        <w:t xml:space="preserve">Cumulative pro token log.</w:t>
-      </w:r>
-      <w:r>
-        <w:t xml:space="preserve"> </w:t>
-      </w:r>
-      <w:r>
-        <w:t xml:space="preserve">The pro FullTeaching total includes its 4LV run in the shared JSONL; the</w:t>
-      </w:r>
-      <w:r>
-        <w:t xml:space="preserve"> </w:t>
-      </w:r>
-      <w:r>
-        <w:t xml:space="preserve">FullTeaching-only figure is the dominant increment but is not cleanly isolated.</w:t>
-      </w:r>
-    </w:p>
-    <w:p>
-      <w:pPr>
-        <w:pStyle w:val="Compact"/>
-        <w:numPr>
-          <w:ilvl w:val="0"/>
-          <w:numId w:val="1007"/>
-        </w:numPr>
-      </w:pPr>
-      <w:r>
-        <w:rPr>
-          <w:b/>
-          <w:bCs/>
-        </w:rPr>
-        <w:t xml:space="preserve">Execution backend mismatch.</w:t>
-      </w:r>
-      <w:r>
-        <w:t xml:space="preserve"> </w:t>
-      </w:r>
-      <w:r>
-        <w:t xml:space="preserve">The execution artifacts were produced with a Gemini backend. A faithful</w:t>
-      </w:r>
-      <w:r>
-        <w:t xml:space="preserve"> </w:t>
-      </w:r>
-      <w:r>
-        <w:t xml:space="preserve">BytePlus execution re-run requires porting</w:t>
-      </w:r>
-      <w:r>
-        <w:t xml:space="preserve"> </w:t>
-      </w:r>
-      <w:r>
-        <w:rPr>
-          <w:rStyle w:val="VerbatimChar"/>
-        </w:rPr>
-        <w:t xml:space="preserve">LLMCaller.py</w:t>
-      </w:r>
-      <w:r>
-        <w:t xml:space="preserve"> </w:t>
-      </w:r>
-      <w:r>
-        <w:t xml:space="preserve">to the OpenAI-compatible client</w:t>
-      </w:r>
-      <w:r>
-        <w:t xml:space="preserve"> </w:t>
-      </w:r>
-      <w:r>
-        <w:rPr>
-          <w:b/>
-          <w:bCs/>
-        </w:rPr>
-        <w:t xml:space="preserve">and a</w:t>
-      </w:r>
-      <w:r>
-        <w:rPr>
-          <w:b/>
-          <w:bCs/>
-        </w:rPr>
-        <w:t xml:space="preserve"> </w:t>
-      </w:r>
-      <w:r>
-        <w:rPr>
-          <w:b/>
-          <w:bCs/>
-        </w:rPr>
-        <w:t xml:space="preserve">vision-capable model</w:t>
-      </w:r>
-      <w:r>
-        <w:t xml:space="preserve"> </w:t>
-      </w:r>
-      <w:r>
-        <w:t xml:space="preserve">for the multi-modal oracle; without image support the dual-channel oracle degrades</w:t>
-      </w:r>
-      <w:r>
-        <w:t xml:space="preserve"> </w:t>
-      </w:r>
-      <w:r>
-        <w:t xml:space="preserve">to DOM-only, weakening exactly the exception flows already identified as weak.</w:t>
-      </w:r>
-    </w:p>
-    <w:p>
-      <w:pPr>
-        <w:pStyle w:val="Compact"/>
-        <w:numPr>
-          <w:ilvl w:val="0"/>
-          <w:numId w:val="1007"/>
-        </w:numPr>
-      </w:pPr>
-      <w:r>
-        <w:rPr>
-          <w:b/>
-          <w:bCs/>
-        </w:rPr>
-        <w:t xml:space="preserve">dola-seed-2-1-turbo</w:t>
-      </w:r>
-      <w:r>
-        <w:t xml:space="preserve"> </w:t>
-      </w:r>
-      <w:r>
-        <w:t xml:space="preserve">was connectivity-validated but not run through a full pipeline; the 3-model</w:t>
-      </w:r>
-      <w:r>
-        <w:t xml:space="preserve"> </w:t>
-      </w:r>
-      <w:r>
-        <w:t xml:space="preserve">comparison is therefore 2-model in practice.</w:t>
-      </w:r>
-    </w:p>
-    <w:p>
-      <w:pPr>
-        <w:pStyle w:val="Compact"/>
-        <w:numPr>
-          <w:ilvl w:val="0"/>
-          <w:numId w:val="1007"/>
-        </w:numPr>
-      </w:pPr>
-      <w:r>
-        <w:rPr>
-          <w:b/>
-          <w:bCs/>
-        </w:rPr>
-        <w:t xml:space="preserve">NL-test soundness/consistency</w:t>
-      </w:r>
-      <w:r>
-        <w:t xml:space="preserve"> </w:t>
-      </w:r>
-      <w:r>
-        <w:t xml:space="preserve">(arXiv:2509.19136): some execution failures may be false failures from</w:t>
-      </w:r>
-      <w:r>
-        <w:t xml:space="preserve"> </w:t>
-      </w:r>
-      <w:r>
-        <w:t xml:space="preserve">NL ambiguity, and re-runs may not be deterministic — an inherent limitation of NL-driven execution.</w:t>
-      </w:r>
-    </w:p>
-    <w:p>
-      <w:r>
-        <w:pict>
-          <v:rect style="width:0;height:1.5pt" o:hralign="center" o:hrstd="t" o:hr="t"/>
-        </w:pict>
-      </w:r>
-    </w:p>
-    <w:bookmarkEnd w:id="30"/>
-    <w:bookmarkEnd w:id="31"/>
-    <w:bookmarkStart w:id="32" w:name="vi.-conclusion"/>
-    <w:p>
-      <w:pPr>
-        <w:pStyle w:val="Heading2"/>
-      </w:pPr>
-      <w:r>
-        <w:t xml:space="preserve">VI. Conclusion</w:t>
-      </w:r>
-    </w:p>
-    <w:p>
-      <w:pPr>
-        <w:pStyle w:val="FirstParagraph"/>
-      </w:pPr>
-      <w:r>
-        <w:t xml:space="preserve">We reproduced the previously published IntelliTest</w:t>
-      </w:r>
-      <w:r>
-        <w:t xml:space="preserve"> </w:t>
-      </w:r>
-      <w:r>
-        <w:rPr>
-          <w:b/>
-          <w:bCs/>
-        </w:rPr>
-        <w:t xml:space="preserve">generation</w:t>
-      </w:r>
-      <w:r>
-        <w:t xml:space="preserve"> </w:t>
-      </w:r>
-      <w:r>
-        <w:t xml:space="preserve">pipeline on a new, provider-agnostic</w:t>
-      </w:r>
-      <w:r>
-        <w:t xml:space="preserve"> </w:t>
-      </w:r>
-      <w:r>
-        <w:t xml:space="preserve">multi-model BytePlus backend with complete token/cost/latency logging; we</w:t>
-      </w:r>
-      <w:r>
-        <w:t xml:space="preserve"> </w:t>
-      </w:r>
-      <w:r>
-        <w:rPr>
-          <w:b/>
-          <w:bCs/>
-        </w:rPr>
-        <w:t xml:space="preserve">integrated</w:t>
-      </w:r>
-      <w:r>
-        <w:t xml:space="preserve"> </w:t>
-      </w:r>
-      <w:r>
-        <w:t xml:space="preserve">it end-to-end with</w:t>
-      </w:r>
-      <w:r>
-        <w:t xml:space="preserve"> </w:t>
-      </w:r>
-      <w:r>
-        <w:t xml:space="preserve">the TEAA</w:t>
-      </w:r>
-      <w:r>
-        <w:t xml:space="preserve"> </w:t>
-      </w:r>
-      <w:r>
-        <w:rPr>
-          <w:b/>
-          <w:bCs/>
-        </w:rPr>
-        <w:t xml:space="preserve">execution</w:t>
-      </w:r>
-      <w:r>
-        <w:t xml:space="preserve"> </w:t>
-      </w:r>
-      <w:r>
-        <w:t xml:space="preserve">agent against a live, locally-deployed FullTeaching system under test; and we reported</w:t>
-      </w:r>
-      <w:r>
-        <w:t xml:space="preserve"> </w:t>
-      </w:r>
-      <w:r>
-        <w:t xml:space="preserve">a</w:t>
-      </w:r>
-      <w:r>
-        <w:t xml:space="preserve"> </w:t>
-      </w:r>
-      <w:r>
-        <w:rPr>
-          <w:b/>
-          <w:bCs/>
-        </w:rPr>
-        <w:t xml:space="preserve">transparent</w:t>
-      </w:r>
-      <w:r>
-        <w:t xml:space="preserve"> </w:t>
-      </w:r>
-      <w:r>
-        <w:t xml:space="preserve">economic and reliability analysis. The generation half is prior work and is credited as</w:t>
-      </w:r>
-      <w:r>
-        <w:t xml:space="preserve"> </w:t>
-      </w:r>
-      <w:r>
-        <w:t xml:space="preserve">such throughout. The contributions of this document are the reproduction (including a real defect fix that</w:t>
-      </w:r>
-      <w:r>
-        <w:t xml:space="preserve"> </w:t>
-      </w:r>
-      <w:r>
-        <w:t xml:space="preserve">was silently zeroing the pipeline on the new backend), the integration that closes the generation→execution</w:t>
-      </w:r>
-      <w:r>
-        <w:t xml:space="preserve"> </w:t>
-      </w:r>
-      <w:r>
-        <w:t xml:space="preserve">loop, the first per-model cost profile for this method (flash ≈ $0.63, pro ≈ $2.19 per full FullTeaching</w:t>
-      </w:r>
-      <w:r>
-        <w:t xml:space="preserve"> </w:t>
-      </w:r>
-      <w:r>
-        <w:t xml:space="preserve">suite; comparable output; pro ~3.5× costlier), and an honest reliability accounting that discloses the</w:t>
-      </w:r>
-      <w:r>
-        <w:t xml:space="preserve"> </w:t>
-      </w:r>
-      <w:r>
-        <w:t xml:space="preserve">42.2%-vs-89.2% population discrepancy and the exception-flow contradiction rather than reporting only the</w:t>
-      </w:r>
-      <w:r>
-        <w:t xml:space="preserve"> </w:t>
-      </w:r>
-      <w:r>
-        <w:t xml:space="preserve">favourable figure. The strongest concurrent competitor for the execution phase is</w:t>
-      </w:r>
-      <w:r>
-        <w:t xml:space="preserve"> </w:t>
-      </w:r>
-      <w:r>
-        <w:rPr>
-          <w:b/>
-          <w:bCs/>
-        </w:rPr>
-        <w:t xml:space="preserve">Yun Lin’s WebTestPilot</w:t>
-      </w:r>
-      <w:r>
-        <w:rPr>
-          <w:b/>
-          <w:bCs/>
-        </w:rPr>
-        <w:t xml:space="preserve"> </w:t>
-      </w:r>
-      <w:r>
-        <w:rPr>
-          <w:b/>
-          <w:bCs/>
-        </w:rPr>
-        <w:t xml:space="preserve">(FSE 2026)</w:t>
-      </w:r>
-      <w:r>
-        <w:t xml:space="preserve">; a faithful head-to-head against it — and measurable improvement of exception-flow reliability</w:t>
-      </w:r>
-      <w:r>
-        <w:t xml:space="preserve"> </w:t>
-      </w:r>
-      <w:r>
-        <w:t xml:space="preserve">via a vision-capable oracle — are the clearest next steps.</w:t>
-      </w:r>
-    </w:p>
-    <w:p>
-      <w:r>
-        <w:pict>
-          <v:rect style="width:0;height:1.5pt" o:hralign="center" o:hrstd="t" o:hr="t"/>
-        </w:pict>
-      </w:r>
-    </w:p>
-    <w:bookmarkEnd w:id="32"/>
-    <w:bookmarkStart w:id="33" w:name="references"/>
-    <w:p>
-      <w:pPr>
-        <w:pStyle w:val="Heading2"/>
-      </w:pPr>
-      <w:r>
-        <w:t xml:space="preserve">References</w:t>
-      </w:r>
-    </w:p>
-    <w:p>
-      <w:pPr>
-        <w:pStyle w:val="FirstParagraph"/>
-      </w:pPr>
-      <w:r>
-        <w:t xml:space="preserve">The complete machine-readable reference set (82 papers, 11-column schema) is in</w:t>
-      </w:r>
-      <w:r>
-        <w:t xml:space="preserve"> </w:t>
-      </w:r>
-      <w:r>
-        <w:rPr>
-          <w:rStyle w:val="VerbatimChar"/>
-        </w:rPr>
-        <w:t xml:space="preserve">research_project/track_A_literature_review/related_articles.xlsx</w:t>
-      </w:r>
-      <w:r>
-        <w:t xml:space="preserve"> </w:t>
-      </w:r>
-      <w:r>
-        <w:t xml:space="preserve">(sheets: Systematic Review [82],</w:t>
-      </w:r>
-      <w:r>
-        <w:t xml:space="preserve"> </w:t>
-      </w:r>
-      <w:r>
-        <w:t xml:space="preserve">New Research 2025-26 [19], All References [101 rows]). Primary anchors cited above:</w:t>
       </w:r>
     </w:p>
     <w:p>
@@ -9910,23 +10665,23 @@
         </w:numPr>
       </w:pPr>
       <w:r>
-        <w:t xml:space="preserve">Prior work:</w:t>
-      </w:r>
-      <w:r>
-        <w:t xml:space="preserve"> </w:t>
-      </w:r>
-      <w:r>
-        <w:rPr>
-          <w:i/>
-          <w:iCs/>
-        </w:rPr>
-        <w:t xml:space="preserve">A Business Process-Centric Approach for LLM-Driven Functional Test Generation</w:t>
-      </w:r>
-      <w:r>
-        <w:t xml:space="preserve"> </w:t>
-      </w:r>
-      <w:r>
-        <w:t xml:space="preserve">(IEEE Access).</w:t>
+        <w:rPr>
+          <w:b/>
+          <w:bCs/>
+        </w:rPr>
+        <w:t xml:space="preserve">Placeholder pricing.</w:t>
+      </w:r>
+      <w:r>
+        <w:t xml:space="preserve"> </w:t>
+      </w:r>
+      <w:r>
+        <w:t xml:space="preserve">All USD figures depend on unofficial per-1M rates; only token counts are ground</w:t>
+      </w:r>
+      <w:r>
+        <w:t xml:space="preserve"> </w:t>
+      </w:r>
+      <w:r>
+        <w:t xml:space="preserve">truth.</w:t>
       </w:r>
     </w:p>
     <w:p>
@@ -9938,56 +10693,23 @@
         </w:numPr>
       </w:pPr>
       <w:r>
-        <w:t xml:space="preserve">X. Teoh,</w:t>
-      </w:r>
-      <w:r>
-        <w:t xml:space="preserve"> </w:t>
-      </w:r>
-      <w:r>
-        <w:rPr>
-          <w:b/>
-          <w:bCs/>
-        </w:rPr>
-        <w:t xml:space="preserve">Y. Lin</w:t>
-      </w:r>
-      <w:r>
-        <w:t xml:space="preserve">, D.-M. Nguyen, R. Ren, W. Zhang, J. S. Dong.</w:t>
-      </w:r>
-      <w:r>
-        <w:t xml:space="preserve"> </w:t>
-      </w:r>
-      <w:r>
-        <w:rPr>
-          <w:i/>
-          <w:iCs/>
-        </w:rPr>
-        <w:t xml:space="preserve">WebTestPilot: Agentic End-to-End Web</w:t>
-      </w:r>
-      <w:r>
-        <w:rPr>
-          <w:i/>
-          <w:iCs/>
-        </w:rPr>
-        <w:t xml:space="preserve"> </w:t>
-      </w:r>
-      <w:r>
-        <w:rPr>
-          <w:i/>
-          <w:iCs/>
-        </w:rPr>
-        <w:t xml:space="preserve">Testing against Natural Language Specification by Inferring Oracles with Symbolized GUI Elements.</w:t>
-      </w:r>
-      <w:r>
-        <w:t xml:space="preserve"> </w:t>
-      </w:r>
-      <w:r>
-        <w:t xml:space="preserve">FSE 2026.</w:t>
-      </w:r>
-      <w:r>
-        <w:t xml:space="preserve"> </w:t>
-      </w:r>
-      <w:r>
-        <w:t xml:space="preserve">arXiv:2602.11724.</w:t>
+        <w:rPr>
+          <w:b/>
+          <w:bCs/>
+        </w:rPr>
+        <w:t xml:space="preserve">Cumulative pro token log.</w:t>
+      </w:r>
+      <w:r>
+        <w:t xml:space="preserve"> </w:t>
+      </w:r>
+      <w:r>
+        <w:t xml:space="preserve">The pro FullTeaching total includes its 4LV run in the shared JSONL; the</w:t>
+      </w:r>
+      <w:r>
+        <w:t xml:space="preserve"> </w:t>
+      </w:r>
+      <w:r>
+        <w:t xml:space="preserve">FullTeaching-only figure is the dominant increment but is not cleanly isolated.</w:t>
       </w:r>
     </w:p>
     <w:p>
@@ -10000,16 +10722,73 @@
       </w:pPr>
       <w:r>
         <w:rPr>
-          <w:i/>
-          <w:iCs/>
-        </w:rPr>
-        <w:t xml:space="preserve">Are Autonomous Web Agents Good Testers? (PinATA / SeeAct-ATA).</w:t>
-      </w:r>
-      <w:r>
-        <w:t xml:space="preserve"> </w:t>
-      </w:r>
-      <w:r>
-        <w:t xml:space="preserve">arXiv:2504.01495.</w:t>
+          <w:b/>
+          <w:bCs/>
+        </w:rPr>
+        <w:t xml:space="preserve">Execution backend mismatch.</w:t>
+      </w:r>
+      <w:r>
+        <w:t xml:space="preserve"> </w:t>
+      </w:r>
+      <w:r>
+        <w:t xml:space="preserve">The execution artifacts were produced with a Gemini backend. A faithful</w:t>
+      </w:r>
+      <w:r>
+        <w:t xml:space="preserve"> </w:t>
+      </w:r>
+      <w:r>
+        <w:t xml:space="preserve">BytePlus execution re-run requires porting</w:t>
+      </w:r>
+      <w:r>
+        <w:t xml:space="preserve"> </w:t>
+      </w:r>
+      <w:r>
+        <w:rPr>
+          <w:rStyle w:val="VerbatimChar"/>
+        </w:rPr>
+        <w:t xml:space="preserve">LLMCaller.py</w:t>
+      </w:r>
+      <w:r>
+        <w:t xml:space="preserve"> </w:t>
+      </w:r>
+      <w:r>
+        <w:t xml:space="preserve">to the OpenAI-compatible client</w:t>
+      </w:r>
+      <w:r>
+        <w:t xml:space="preserve"> </w:t>
+      </w:r>
+      <w:r>
+        <w:rPr>
+          <w:b/>
+          <w:bCs/>
+        </w:rPr>
+        <w:t xml:space="preserve">and a</w:t>
+      </w:r>
+      <w:r>
+        <w:rPr>
+          <w:b/>
+          <w:bCs/>
+        </w:rPr>
+        <w:t xml:space="preserve"> </w:t>
+      </w:r>
+      <w:r>
+        <w:rPr>
+          <w:b/>
+          <w:bCs/>
+        </w:rPr>
+        <w:t xml:space="preserve">vision-capable model</w:t>
+      </w:r>
+      <w:r>
+        <w:t xml:space="preserve"> </w:t>
+      </w:r>
+      <w:r>
+        <w:t xml:space="preserve">for the multi-modal oracle; without image support the dual-channel oracle degrades</w:t>
+      </w:r>
+      <w:r>
+        <w:t xml:space="preserve"> </w:t>
+      </w:r>
+      <w:r>
+        <w:t xml:space="preserve">to DOM-only, weakening exactly the exception flows already identified as weak.</w:t>
       </w:r>
     </w:p>
     <w:p>
@@ -10021,23 +10800,23 @@
         </w:numPr>
       </w:pPr>
       <w:r>
-        <w:t xml:space="preserve">C. Augusto et al.,</w:t>
-      </w:r>
-      <w:r>
-        <w:t xml:space="preserve"> </w:t>
-      </w:r>
-      <w:r>
-        <w:rPr>
-          <w:i/>
-          <w:iCs/>
-        </w:rPr>
-        <w:t xml:space="preserve">Software System Testing assisted by LLMs: An Exploratory Study.</w:t>
-      </w:r>
-      <w:r>
-        <w:t xml:space="preserve"> </w:t>
-      </w:r>
-      <w:r>
-        <w:t xml:space="preserve">ICTSS 2024.</w:t>
+        <w:rPr>
+          <w:b/>
+          <w:bCs/>
+        </w:rPr>
+        <w:t xml:space="preserve">dola-seed-2-1-turbo</w:t>
+      </w:r>
+      <w:r>
+        <w:t xml:space="preserve"> </w:t>
+      </w:r>
+      <w:r>
+        <w:t xml:space="preserve">was connectivity-validated but not run through a full pipeline; the 3-model</w:t>
+      </w:r>
+      <w:r>
+        <w:t xml:space="preserve"> </w:t>
+      </w:r>
+      <w:r>
+        <w:t xml:space="preserve">comparison is therefore 2-model in practice.</w:t>
       </w:r>
     </w:p>
     <w:p>
@@ -10049,37 +10828,246 @@
         </w:numPr>
       </w:pPr>
       <w:r>
-        <w:t xml:space="preserve">D. Milchevski et al.,</w:t>
-      </w:r>
-      <w:r>
-        <w:t xml:space="preserve"> </w:t>
-      </w:r>
-      <w:r>
-        <w:rPr>
-          <w:i/>
-          <w:iCs/>
-        </w:rPr>
-        <w:t xml:space="preserve">Multi-Step Generation of Test Specifications using LLMs for System-Level</w:t>
-      </w:r>
-      <w:r>
-        <w:rPr>
-          <w:i/>
-          <w:iCs/>
-        </w:rPr>
-        <w:t xml:space="preserve"> </w:t>
-      </w:r>
-      <w:r>
-        <w:rPr>
-          <w:i/>
-          <w:iCs/>
-        </w:rPr>
-        <w:t xml:space="preserve">Requirements.</w:t>
-      </w:r>
-      <w:r>
-        <w:t xml:space="preserve"> </w:t>
-      </w:r>
-      <w:r>
-        <w:t xml:space="preserve">ACL 2025 (Industry).</w:t>
+        <w:rPr>
+          <w:b/>
+          <w:bCs/>
+        </w:rPr>
+        <w:t xml:space="preserve">NL-test soundness/consistency</w:t>
+      </w:r>
+      <w:r>
+        <w:t xml:space="preserve"> </w:t>
+      </w:r>
+      <w:r>
+        <w:t xml:space="preserve">(arXiv:2509.19136): some execution failures may be false failures from</w:t>
+      </w:r>
+      <w:r>
+        <w:t xml:space="preserve"> </w:t>
+      </w:r>
+      <w:r>
+        <w:t xml:space="preserve">NL ambiguity, and re-runs may not be deterministic — an inherent limitation of NL-driven execution.</w:t>
+      </w:r>
+    </w:p>
+    <w:p>
+      <w:r>
+        <w:pict>
+          <v:rect style="width:0;height:1.5pt" o:hralign="center" o:hrstd="t" o:hr="t"/>
+        </w:pict>
+      </w:r>
+    </w:p>
+    <w:bookmarkEnd w:id="30"/>
+    <w:bookmarkEnd w:id="31"/>
+    <w:bookmarkStart w:id="32" w:name="vi.-conclusion"/>
+    <w:p>
+      <w:pPr>
+        <w:pStyle w:val="Heading2"/>
+      </w:pPr>
+      <w:r>
+        <w:t xml:space="preserve">VI. Conclusion</w:t>
+      </w:r>
+    </w:p>
+    <w:p>
+      <w:pPr>
+        <w:pStyle w:val="FirstParagraph"/>
+      </w:pPr>
+      <w:r>
+        <w:t xml:space="preserve">We reproduced the previously published IntelliTest</w:t>
+      </w:r>
+      <w:r>
+        <w:t xml:space="preserve"> </w:t>
+      </w:r>
+      <w:r>
+        <w:rPr>
+          <w:b/>
+          <w:bCs/>
+        </w:rPr>
+        <w:t xml:space="preserve">generation</w:t>
+      </w:r>
+      <w:r>
+        <w:t xml:space="preserve"> </w:t>
+      </w:r>
+      <w:r>
+        <w:t xml:space="preserve">pipeline on a new, provider-agnostic</w:t>
+      </w:r>
+      <w:r>
+        <w:t xml:space="preserve"> </w:t>
+      </w:r>
+      <w:r>
+        <w:t xml:space="preserve">multi-model BytePlus backend with complete token/cost/latency logging; we</w:t>
+      </w:r>
+      <w:r>
+        <w:t xml:space="preserve"> </w:t>
+      </w:r>
+      <w:r>
+        <w:rPr>
+          <w:b/>
+          <w:bCs/>
+        </w:rPr>
+        <w:t xml:space="preserve">integrated</w:t>
+      </w:r>
+      <w:r>
+        <w:t xml:space="preserve"> </w:t>
+      </w:r>
+      <w:r>
+        <w:t xml:space="preserve">it end-to-end with</w:t>
+      </w:r>
+      <w:r>
+        <w:t xml:space="preserve"> </w:t>
+      </w:r>
+      <w:r>
+        <w:t xml:space="preserve">the TEAA</w:t>
+      </w:r>
+      <w:r>
+        <w:t xml:space="preserve"> </w:t>
+      </w:r>
+      <w:r>
+        <w:rPr>
+          <w:b/>
+          <w:bCs/>
+        </w:rPr>
+        <w:t xml:space="preserve">execution</w:t>
+      </w:r>
+      <w:r>
+        <w:t xml:space="preserve"> </w:t>
+      </w:r>
+      <w:r>
+        <w:t xml:space="preserve">agent against a live, locally-deployed FullTeaching system under test; and we reported</w:t>
+      </w:r>
+      <w:r>
+        <w:t xml:space="preserve"> </w:t>
+      </w:r>
+      <w:r>
+        <w:t xml:space="preserve">a</w:t>
+      </w:r>
+      <w:r>
+        <w:t xml:space="preserve"> </w:t>
+      </w:r>
+      <w:r>
+        <w:rPr>
+          <w:b/>
+          <w:bCs/>
+        </w:rPr>
+        <w:t xml:space="preserve">transparent</w:t>
+      </w:r>
+      <w:r>
+        <w:t xml:space="preserve"> </w:t>
+      </w:r>
+      <w:r>
+        <w:t xml:space="preserve">economic and reliability analysis. The generation half is prior work and is credited as</w:t>
+      </w:r>
+      <w:r>
+        <w:t xml:space="preserve"> </w:t>
+      </w:r>
+      <w:r>
+        <w:t xml:space="preserve">such throughout. The contributions of this document are the reproduction (including a real defect fix that</w:t>
+      </w:r>
+      <w:r>
+        <w:t xml:space="preserve"> </w:t>
+      </w:r>
+      <w:r>
+        <w:t xml:space="preserve">was silently zeroing the pipeline on the new backend), the integration that closes the generation→execution</w:t>
+      </w:r>
+      <w:r>
+        <w:t xml:space="preserve"> </w:t>
+      </w:r>
+      <w:r>
+        <w:t xml:space="preserve">loop, the first per-model cost profile for this method (flash ≈ $0.63, pro ≈ $2.19 per full FullTeaching</w:t>
+      </w:r>
+      <w:r>
+        <w:t xml:space="preserve"> </w:t>
+      </w:r>
+      <w:r>
+        <w:t xml:space="preserve">suite; comparable output; pro ~3.5× costlier), and an honest reliability accounting that discloses the</w:t>
+      </w:r>
+      <w:r>
+        <w:t xml:space="preserve"> </w:t>
+      </w:r>
+      <w:r>
+        <w:t xml:space="preserve">42.2%-vs-89.2% population discrepancy and the exception-flow contradiction rather than reporting only the</w:t>
+      </w:r>
+      <w:r>
+        <w:t xml:space="preserve"> </w:t>
+      </w:r>
+      <w:r>
+        <w:t xml:space="preserve">favourable figure. The strongest concurrent competitor for the execution phase is</w:t>
+      </w:r>
+      <w:r>
+        <w:t xml:space="preserve"> </w:t>
+      </w:r>
+      <w:r>
+        <w:rPr>
+          <w:b/>
+          <w:bCs/>
+        </w:rPr>
+        <w:t xml:space="preserve">Yun Lin’s WebTestPilot</w:t>
+      </w:r>
+      <w:r>
+        <w:rPr>
+          <w:b/>
+          <w:bCs/>
+        </w:rPr>
+        <w:t xml:space="preserve"> </w:t>
+      </w:r>
+      <w:r>
+        <w:rPr>
+          <w:b/>
+          <w:bCs/>
+        </w:rPr>
+        <w:t xml:space="preserve">(FSE 2026)</w:t>
+      </w:r>
+      <w:r>
+        <w:t xml:space="preserve">; a faithful head-to-head against it — and measurable improvement of exception-flow reliability</w:t>
+      </w:r>
+      <w:r>
+        <w:t xml:space="preserve"> </w:t>
+      </w:r>
+      <w:r>
+        <w:t xml:space="preserve">via a vision-capable oracle — are the clearest next steps.</w:t>
+      </w:r>
+    </w:p>
+    <w:p>
+      <w:r>
+        <w:pict>
+          <v:rect style="width:0;height:1.5pt" o:hralign="center" o:hrstd="t" o:hr="t"/>
+        </w:pict>
+      </w:r>
+    </w:p>
+    <w:bookmarkEnd w:id="32"/>
+    <w:bookmarkStart w:id="33" w:name="references"/>
+    <w:p>
+      <w:pPr>
+        <w:pStyle w:val="Heading2"/>
+      </w:pPr>
+      <w:r>
+        <w:t xml:space="preserve">References</w:t>
+      </w:r>
+    </w:p>
+    <w:p>
+      <w:pPr>
+        <w:pStyle w:val="FirstParagraph"/>
+      </w:pPr>
+      <w:r>
+        <w:t xml:space="preserve">The complete machine-readable reference set (82 papers, 11-column schema) is in</w:t>
+      </w:r>
+      <w:r>
+        <w:t xml:space="preserve"> </w:t>
+      </w:r>
+      <w:r>
+        <w:rPr>
+          <w:rStyle w:val="VerbatimChar"/>
+        </w:rPr>
+        <w:t xml:space="preserve">research_project/track_A_literature_review/related_articles.xlsx</w:t>
+      </w:r>
+      <w:r>
+        <w:t xml:space="preserve"> </w:t>
+      </w:r>
+      <w:r>
+        <w:t xml:space="preserve">(sheets: Systematic Review [82],</w:t>
+      </w:r>
+      <w:r>
+        <w:t xml:space="preserve"> </w:t>
+      </w:r>
+      <w:r>
+        <w:t xml:space="preserve">New Research 2025-26 [19], All References [101 rows]). Primary anchors cited above:</w:t>
       </w:r>
     </w:p>
     <w:p>
@@ -10087,11 +11075,11 @@
         <w:pStyle w:val="Compact"/>
         <w:numPr>
           <w:ilvl w:val="0"/>
-          <w:numId w:val="1008"/>
+          <w:numId w:val="1009"/>
         </w:numPr>
       </w:pPr>
       <w:r>
-        <w:t xml:space="preserve">S. Bhatia, T. Gandhi, D. Kumar, P. Jalote.</w:t>
+        <w:t xml:space="preserve">Prior work:</w:t>
       </w:r>
       <w:r>
         <w:t xml:space="preserve"> </w:t>
@@ -10101,27 +11089,13 @@
           <w:i/>
           <w:iCs/>
         </w:rPr>
-        <w:t xml:space="preserve">System test case design from requirements specifications:</w:t>
-      </w:r>
-      <w:r>
-        <w:rPr>
-          <w:i/>
-          <w:iCs/>
-        </w:rPr>
-        <w:t xml:space="preserve"> </w:t>
-      </w:r>
-      <w:r>
-        <w:rPr>
-          <w:i/>
-          <w:iCs/>
-        </w:rPr>
-        <w:t xml:space="preserve">insights and challenges of using ChatGPT.</w:t>
-      </w:r>
-      <w:r>
-        <w:t xml:space="preserve"> </w:t>
-      </w:r>
-      <w:r>
-        <w:t xml:space="preserve">2024.</w:t>
+        <w:t xml:space="preserve">A Business Process-Centric Approach for LLM-Driven Functional Test Generation</w:t>
+      </w:r>
+      <w:r>
+        <w:t xml:space="preserve"> </w:t>
+      </w:r>
+      <w:r>
+        <w:t xml:space="preserve">(IEEE Access).</w:t>
       </w:r>
     </w:p>
     <w:p>
@@ -10129,11 +11103,24 @@
         <w:pStyle w:val="Compact"/>
         <w:numPr>
           <w:ilvl w:val="0"/>
-          <w:numId w:val="1008"/>
+          <w:numId w:val="1009"/>
         </w:numPr>
       </w:pPr>
       <w:r>
-        <w:t xml:space="preserve">J. Wang et al.,</w:t>
+        <w:t xml:space="preserve">X. Teoh,</w:t>
+      </w:r>
+      <w:r>
+        <w:t xml:space="preserve"> </w:t>
+      </w:r>
+      <w:r>
+        <w:rPr>
+          <w:b/>
+          <w:bCs/>
+        </w:rPr>
+        <w:t xml:space="preserve">Y. Lin</w:t>
+      </w:r>
+      <w:r>
+        <w:t xml:space="preserve">, D.-M. Nguyen, R. Ren, W. Zhang, J. S. Dong.</w:t>
       </w:r>
       <w:r>
         <w:t xml:space="preserve"> </w:t>
@@ -10143,13 +11130,33 @@
           <w:i/>
           <w:iCs/>
         </w:rPr>
-        <w:t xml:space="preserve">Software Testing with LLMs: Survey, Landscape, and Vision.</w:t>
-      </w:r>
-      <w:r>
-        <w:t xml:space="preserve"> </w:t>
-      </w:r>
-      <w:r>
-        <w:t xml:space="preserve">IEEE TSE 2024.</w:t>
+        <w:t xml:space="preserve">WebTestPilot: Agentic End-to-End Web</w:t>
+      </w:r>
+      <w:r>
+        <w:rPr>
+          <w:i/>
+          <w:iCs/>
+        </w:rPr>
+        <w:t xml:space="preserve"> </w:t>
+      </w:r>
+      <w:r>
+        <w:rPr>
+          <w:i/>
+          <w:iCs/>
+        </w:rPr>
+        <w:t xml:space="preserve">Testing against Natural Language Specification by Inferring Oracles with Symbolized GUI Elements.</w:t>
+      </w:r>
+      <w:r>
+        <w:t xml:space="preserve"> </w:t>
+      </w:r>
+      <w:r>
+        <w:t xml:space="preserve">FSE 2026.</w:t>
+      </w:r>
+      <w:r>
+        <w:t xml:space="preserve"> </w:t>
+      </w:r>
+      <w:r>
+        <w:t xml:space="preserve">arXiv:2602.11724.</w:t>
       </w:r>
     </w:p>
     <w:p>
@@ -10157,27 +11164,21 @@
         <w:pStyle w:val="Compact"/>
         <w:numPr>
           <w:ilvl w:val="0"/>
-          <w:numId w:val="1008"/>
+          <w:numId w:val="1009"/>
         </w:numPr>
       </w:pPr>
-      <w:r>
-        <w:t xml:space="preserve">X. Hou et al.,</w:t>
-      </w:r>
-      <w:r>
-        <w:t xml:space="preserve"> </w:t>
-      </w:r>
       <w:r>
         <w:rPr>
           <w:i/>
           <w:iCs/>
         </w:rPr>
-        <w:t xml:space="preserve">LLMs for Software Engineering: A Systematic Literature Review.</w:t>
-      </w:r>
-      <w:r>
-        <w:t xml:space="preserve"> </w:t>
-      </w:r>
-      <w:r>
-        <w:t xml:space="preserve">ACM TOSEM 2024.</w:t>
+        <w:t xml:space="preserve">Are Autonomous Web Agents Good Testers? (PinATA / SeeAct-ATA).</w:t>
+      </w:r>
+      <w:r>
+        <w:t xml:space="preserve"> </w:t>
+      </w:r>
+      <w:r>
+        <w:t xml:space="preserve">arXiv:2504.01495.</w:t>
       </w:r>
     </w:p>
     <w:p>
@@ -10185,11 +11186,11 @@
         <w:pStyle w:val="Compact"/>
         <w:numPr>
           <w:ilvl w:val="0"/>
-          <w:numId w:val="1008"/>
+          <w:numId w:val="1009"/>
         </w:numPr>
       </w:pPr>
       <w:r>
-        <w:t xml:space="preserve">H. He et al.,</w:t>
+        <w:t xml:space="preserve">C. Augusto et al.,</w:t>
       </w:r>
       <w:r>
         <w:t xml:space="preserve"> </w:t>
@@ -10199,13 +11200,13 @@
           <w:i/>
           <w:iCs/>
         </w:rPr>
-        <w:t xml:space="preserve">WebVoyager: Building an End-to-End Web Agent with LMMs.</w:t>
-      </w:r>
-      <w:r>
-        <w:t xml:space="preserve"> </w:t>
-      </w:r>
-      <w:r>
-        <w:t xml:space="preserve">ACL 2024.</w:t>
+        <w:t xml:space="preserve">Software System Testing assisted by LLMs: An Exploratory Study.</w:t>
+      </w:r>
+      <w:r>
+        <w:t xml:space="preserve"> </w:t>
+      </w:r>
+      <w:r>
+        <w:t xml:space="preserve">ICTSS 2024.</w:t>
       </w:r>
     </w:p>
     <w:p>
@@ -10213,11 +11214,11 @@
         <w:pStyle w:val="Compact"/>
         <w:numPr>
           <w:ilvl w:val="0"/>
-          <w:numId w:val="1008"/>
+          <w:numId w:val="1009"/>
         </w:numPr>
       </w:pPr>
       <w:r>
-        <w:t xml:space="preserve">J. Yoon, R. Feldt, S. Yoo.</w:t>
+        <w:t xml:space="preserve">D. Milchevski et al.,</w:t>
       </w:r>
       <w:r>
         <w:t xml:space="preserve"> </w:t>
@@ -10227,13 +11228,27 @@
           <w:i/>
           <w:iCs/>
         </w:rPr>
-        <w:t xml:space="preserve">DroidAgent</w:t>
-      </w:r>
-      <w:r>
-        <w:t xml:space="preserve"> </w:t>
-      </w:r>
-      <w:r>
-        <w:t xml:space="preserve">(intent-driven mobile GUI testing).</w:t>
+        <w:t xml:space="preserve">Multi-Step Generation of Test Specifications using LLMs for System-Level</w:t>
+      </w:r>
+      <w:r>
+        <w:rPr>
+          <w:i/>
+          <w:iCs/>
+        </w:rPr>
+        <w:t xml:space="preserve"> </w:t>
+      </w:r>
+      <w:r>
+        <w:rPr>
+          <w:i/>
+          <w:iCs/>
+        </w:rPr>
+        <w:t xml:space="preserve">Requirements.</w:t>
+      </w:r>
+      <w:r>
+        <w:t xml:space="preserve"> </w:t>
+      </w:r>
+      <w:r>
+        <w:t xml:space="preserve">ACL 2025 (Industry).</w:t>
       </w:r>
     </w:p>
     <w:p>
@@ -10241,11 +11256,11 @@
         <w:pStyle w:val="Compact"/>
         <w:numPr>
           <w:ilvl w:val="0"/>
-          <w:numId w:val="1008"/>
+          <w:numId w:val="1009"/>
         </w:numPr>
       </w:pPr>
       <w:r>
-        <w:t xml:space="preserve">Z. Liu et al.,</w:t>
+        <w:t xml:space="preserve">S. Bhatia, T. Gandhi, D. Kumar, P. Jalote.</w:t>
       </w:r>
       <w:r>
         <w:t xml:space="preserve"> </w:t>
@@ -10255,13 +11270,27 @@
           <w:i/>
           <w:iCs/>
         </w:rPr>
-        <w:t xml:space="preserve">GPTDroid</w:t>
-      </w:r>
-      <w:r>
-        <w:t xml:space="preserve"> </w:t>
-      </w:r>
-      <w:r>
-        <w:t xml:space="preserve">(functionality-aware mobile GUI testing). ICSE 2024.</w:t>
+        <w:t xml:space="preserve">System test case design from requirements specifications:</w:t>
+      </w:r>
+      <w:r>
+        <w:rPr>
+          <w:i/>
+          <w:iCs/>
+        </w:rPr>
+        <w:t xml:space="preserve"> </w:t>
+      </w:r>
+      <w:r>
+        <w:rPr>
+          <w:i/>
+          <w:iCs/>
+        </w:rPr>
+        <w:t xml:space="preserve">insights and challenges of using ChatGPT.</w:t>
+      </w:r>
+      <w:r>
+        <w:t xml:space="preserve"> </w:t>
+      </w:r>
+      <w:r>
+        <w:t xml:space="preserve">2024.</w:t>
       </w:r>
     </w:p>
     <w:p>
@@ -10269,23 +11298,27 @@
         <w:pStyle w:val="Compact"/>
         <w:numPr>
           <w:ilvl w:val="0"/>
-          <w:numId w:val="1008"/>
+          <w:numId w:val="1009"/>
         </w:numPr>
       </w:pPr>
       <w:r>
-        <w:t xml:space="preserve">Emerging concerns: NL soundness/consistency (arXiv:2509.19136); self-healing DOM (arXiv:2603.20358);</w:t>
-      </w:r>
-      <w:r>
-        <w:t xml:space="preserve"> </w:t>
-      </w:r>
-      <w:r>
-        <w:t xml:space="preserve">autonomous repair limits (arXiv:2605.01471); Prune4Web DOM pruning (arXiv:2511.21398); accessibility-tree</w:t>
-      </w:r>
-      <w:r>
-        <w:t xml:space="preserve"> </w:t>
-      </w:r>
-      <w:r>
-        <w:t xml:space="preserve">prompt injection (arXiv:2507.14799); requirement→oracle on real bugs (arXiv:2607.10277).</w:t>
+        <w:t xml:space="preserve">J. Wang et al.,</w:t>
+      </w:r>
+      <w:r>
+        <w:t xml:space="preserve"> </w:t>
+      </w:r>
+      <w:r>
+        <w:rPr>
+          <w:i/>
+          <w:iCs/>
+        </w:rPr>
+        <w:t xml:space="preserve">Software Testing with LLMs: Survey, Landscape, and Vision.</w:t>
+      </w:r>
+      <w:r>
+        <w:t xml:space="preserve"> </w:t>
+      </w:r>
+      <w:r>
+        <w:t xml:space="preserve">IEEE TSE 2024.</w:t>
       </w:r>
     </w:p>
     <w:p>
@@ -10293,7 +11326,143 @@
         <w:pStyle w:val="Compact"/>
         <w:numPr>
           <w:ilvl w:val="0"/>
-          <w:numId w:val="1008"/>
+          <w:numId w:val="1009"/>
+        </w:numPr>
+      </w:pPr>
+      <w:r>
+        <w:t xml:space="preserve">X. Hou et al.,</w:t>
+      </w:r>
+      <w:r>
+        <w:t xml:space="preserve"> </w:t>
+      </w:r>
+      <w:r>
+        <w:rPr>
+          <w:i/>
+          <w:iCs/>
+        </w:rPr>
+        <w:t xml:space="preserve">LLMs for Software Engineering: A Systematic Literature Review.</w:t>
+      </w:r>
+      <w:r>
+        <w:t xml:space="preserve"> </w:t>
+      </w:r>
+      <w:r>
+        <w:t xml:space="preserve">ACM TOSEM 2024.</w:t>
+      </w:r>
+    </w:p>
+    <w:p>
+      <w:pPr>
+        <w:pStyle w:val="Compact"/>
+        <w:numPr>
+          <w:ilvl w:val="0"/>
+          <w:numId w:val="1009"/>
+        </w:numPr>
+      </w:pPr>
+      <w:r>
+        <w:t xml:space="preserve">H. He et al.,</w:t>
+      </w:r>
+      <w:r>
+        <w:t xml:space="preserve"> </w:t>
+      </w:r>
+      <w:r>
+        <w:rPr>
+          <w:i/>
+          <w:iCs/>
+        </w:rPr>
+        <w:t xml:space="preserve">WebVoyager: Building an End-to-End Web Agent with LMMs.</w:t>
+      </w:r>
+      <w:r>
+        <w:t xml:space="preserve"> </w:t>
+      </w:r>
+      <w:r>
+        <w:t xml:space="preserve">ACL 2024.</w:t>
+      </w:r>
+    </w:p>
+    <w:p>
+      <w:pPr>
+        <w:pStyle w:val="Compact"/>
+        <w:numPr>
+          <w:ilvl w:val="0"/>
+          <w:numId w:val="1009"/>
+        </w:numPr>
+      </w:pPr>
+      <w:r>
+        <w:t xml:space="preserve">J. Yoon, R. Feldt, S. Yoo.</w:t>
+      </w:r>
+      <w:r>
+        <w:t xml:space="preserve"> </w:t>
+      </w:r>
+      <w:r>
+        <w:rPr>
+          <w:i/>
+          <w:iCs/>
+        </w:rPr>
+        <w:t xml:space="preserve">DroidAgent</w:t>
+      </w:r>
+      <w:r>
+        <w:t xml:space="preserve"> </w:t>
+      </w:r>
+      <w:r>
+        <w:t xml:space="preserve">(intent-driven mobile GUI testing).</w:t>
+      </w:r>
+    </w:p>
+    <w:p>
+      <w:pPr>
+        <w:pStyle w:val="Compact"/>
+        <w:numPr>
+          <w:ilvl w:val="0"/>
+          <w:numId w:val="1009"/>
+        </w:numPr>
+      </w:pPr>
+      <w:r>
+        <w:t xml:space="preserve">Z. Liu et al.,</w:t>
+      </w:r>
+      <w:r>
+        <w:t xml:space="preserve"> </w:t>
+      </w:r>
+      <w:r>
+        <w:rPr>
+          <w:i/>
+          <w:iCs/>
+        </w:rPr>
+        <w:t xml:space="preserve">GPTDroid</w:t>
+      </w:r>
+      <w:r>
+        <w:t xml:space="preserve"> </w:t>
+      </w:r>
+      <w:r>
+        <w:t xml:space="preserve">(functionality-aware mobile GUI testing). ICSE 2024.</w:t>
+      </w:r>
+    </w:p>
+    <w:p>
+      <w:pPr>
+        <w:pStyle w:val="Compact"/>
+        <w:numPr>
+          <w:ilvl w:val="0"/>
+          <w:numId w:val="1009"/>
+        </w:numPr>
+      </w:pPr>
+      <w:r>
+        <w:t xml:space="preserve">Emerging concerns: NL soundness/consistency (arXiv:2509.19136); self-healing DOM (arXiv:2603.20358);</w:t>
+      </w:r>
+      <w:r>
+        <w:t xml:space="preserve"> </w:t>
+      </w:r>
+      <w:r>
+        <w:t xml:space="preserve">autonomous repair limits (arXiv:2605.01471); Prune4Web DOM pruning (arXiv:2511.21398); accessibility-tree</w:t>
+      </w:r>
+      <w:r>
+        <w:t xml:space="preserve"> </w:t>
+      </w:r>
+      <w:r>
+        <w:t xml:space="preserve">prompt injection (arXiv:2507.14799); requirement→oracle on real bugs (arXiv:2607.10277).</w:t>
+      </w:r>
+    </w:p>
+    <w:p>
+      <w:pPr>
+        <w:pStyle w:val="Compact"/>
+        <w:numPr>
+          <w:ilvl w:val="0"/>
+          <w:numId w:val="1009"/>
         </w:numPr>
       </w:pPr>
       <w:r>
@@ -10785,12 +11954,24 @@
     </w:p>
     <w:p>
       <w:pPr>
-        <w:pStyle w:val="Compact"/>
-        <w:numPr>
-          <w:ilvl w:val="0"/>
-          <w:numId w:val="1009"/>
-        </w:numPr>
-      </w:pPr>
+        <w:pStyle w:val="FirstParagraph"/>
+      </w:pPr>
+      <w:r>
+        <w:rPr>
+          <w:b/>
+          <w:bCs/>
+        </w:rPr>
+        <w:t xml:space="preserve">Phase 1 — Generation (IntelliTest vs. Baselines 1/2/3):</w:t>
+      </w:r>
+      <w:r>
+        <w:t xml:space="preserve"> </w:t>
+      </w:r>
+      <w:r>
+        <w:t xml:space="preserve">-</w:t>
+      </w:r>
+      <w:r>
+        <w:t xml:space="preserve"> </w:t>
+      </w:r>
       <w:r>
         <w:rPr>
           <w:b/>
@@ -10802,17 +11983,23 @@
         <w:t xml:space="preserve"> </w:t>
       </w:r>
       <w:r>
-        <w:t xml:space="preserve">Generation: total tokens per model (FullTeaching latest run).</w:t>
-      </w:r>
-    </w:p>
-    <w:p>
-      <w:pPr>
-        <w:pStyle w:val="Compact"/>
-        <w:numPr>
-          <w:ilvl w:val="0"/>
-          <w:numId w:val="1009"/>
-        </w:numPr>
-      </w:pPr>
+        <w:t xml:space="preserve">Total tokens and USD cost per method, same 4LV/RetailOnboardPro input (IntelliTest flash/pro vs.</w:t>
+      </w:r>
+      <w:r>
+        <w:t xml:space="preserve"> </w:t>
+      </w:r>
+      <w:r>
+        <w:t xml:space="preserve">Baseline 1/2/3) — the primary cross-method cost comparison.</w:t>
+      </w:r>
+      <w:r>
+        <w:t xml:space="preserve"> </w:t>
+      </w:r>
+      <w:r>
+        <w:t xml:space="preserve">-</w:t>
+      </w:r>
+      <w:r>
+        <w:t xml:space="preserve"> </w:t>
+      </w:r>
       <w:r>
         <w:rPr>
           <w:b/>
@@ -10824,17 +12011,39 @@
         <w:t xml:space="preserve"> </w:t>
       </w:r>
       <w:r>
-        <w:t xml:space="preserve">Generation: USD cost per model (placeholder rates, labeled as such).</w:t>
-      </w:r>
-    </w:p>
-    <w:p>
-      <w:pPr>
-        <w:pStyle w:val="Compact"/>
-        <w:numPr>
-          <w:ilvl w:val="0"/>
-          <w:numId w:val="1009"/>
-        </w:numPr>
-      </w:pPr>
+        <w:t xml:space="preserve">Number of LLM calls and average tokens/call per method — efficiency view explaining</w:t>
+      </w:r>
+      <w:r>
+        <w:t xml:space="preserve"> </w:t>
+      </w:r>
+      <w:r>
+        <w:rPr>
+          <w:i/>
+          <w:iCs/>
+        </w:rPr>
+        <w:t xml:space="preserve">why</w:t>
+      </w:r>
+      <w:r>
+        <w:t xml:space="preserve"> </w:t>
+      </w:r>
+      <w:r>
+        <w:t xml:space="preserve">costs</w:t>
+      </w:r>
+      <w:r>
+        <w:t xml:space="preserve"> </w:t>
+      </w:r>
+      <w:r>
+        <w:t xml:space="preserve">differ (Baseline 1’s cross-validation prompts are the most token-hungry per call).</w:t>
+      </w:r>
+      <w:r>
+        <w:t xml:space="preserve"> </w:t>
+      </w:r>
+      <w:r>
+        <w:t xml:space="preserve">-</w:t>
+      </w:r>
+      <w:r>
+        <w:t xml:space="preserve"> </w:t>
+      </w:r>
       <w:r>
         <w:rPr>
           <w:b/>
@@ -10846,17 +12055,17 @@
         <w:t xml:space="preserve"> </w:t>
       </w:r>
       <w:r>
-        <w:t xml:space="preserve">Generation: tokens by pipeline module (test_case_generator dominates ~67%).</w:t>
-      </w:r>
-    </w:p>
-    <w:p>
-      <w:pPr>
-        <w:pStyle w:val="Compact"/>
-        <w:numPr>
-          <w:ilvl w:val="0"/>
-          <w:numId w:val="1009"/>
-        </w:numPr>
-      </w:pPr>
+        <w:t xml:space="preserve">IntelliTest model comparison: flash vs. pro on the full-scale FullTeaching run (tokens, cost, calls).</w:t>
+      </w:r>
+      <w:r>
+        <w:t xml:space="preserve"> </w:t>
+      </w:r>
+      <w:r>
+        <w:t xml:space="preserve">-</w:t>
+      </w:r>
+      <w:r>
+        <w:t xml:space="preserve"> </w:t>
+      </w:r>
       <w:r>
         <w:rPr>
           <w:b/>
@@ -10868,17 +12077,44 @@
         <w:t xml:space="preserve"> </w:t>
       </w:r>
       <w:r>
-        <w:t xml:space="preserve">Generation: wall-clock minutes per run.</w:t>
-      </w:r>
-    </w:p>
-    <w:p>
-      <w:pPr>
-        <w:pStyle w:val="Compact"/>
-        <w:numPr>
-          <w:ilvl w:val="0"/>
-          <w:numId w:val="1009"/>
-        </w:numPr>
-      </w:pPr>
+        <w:t xml:space="preserve">IntelliTest tokens by pipeline stage (FullTeaching, flash) —</w:t>
+      </w:r>
+      <w:r>
+        <w:t xml:space="preserve"> </w:t>
+      </w:r>
+      <w:r>
+        <w:rPr>
+          <w:rStyle w:val="VerbatimChar"/>
+        </w:rPr>
+        <w:t xml:space="preserve">test_case_generator</w:t>
+      </w:r>
+      <w:r>
+        <w:t xml:space="preserve"> </w:t>
+      </w:r>
+      <w:r>
+        <w:t xml:space="preserve">dominates.</w:t>
+      </w:r>
+    </w:p>
+    <w:p>
+      <w:pPr>
+        <w:pStyle w:val="BodyText"/>
+      </w:pPr>
+      <w:r>
+        <w:rPr>
+          <w:b/>
+          <w:bCs/>
+        </w:rPr>
+        <w:t xml:space="preserve">Phase 2 — Execution (TEAA agent vs. static-script baseline):</w:t>
+      </w:r>
+      <w:r>
+        <w:t xml:space="preserve"> </w:t>
+      </w:r>
+      <w:r>
+        <w:t xml:space="preserve">-</w:t>
+      </w:r>
+      <w:r>
+        <w:t xml:space="preserve"> </w:t>
+      </w:r>
       <w:r>
         <w:rPr>
           <w:b/>
@@ -10890,17 +12126,23 @@
         <w:t xml:space="preserve"> </w:t>
       </w:r>
       <w:r>
-        <w:t xml:space="preserve">Execution: pass/fail by business process (overall 42.2% success, N=166; BP1 = 132/166).</w:t>
-      </w:r>
-    </w:p>
-    <w:p>
-      <w:pPr>
-        <w:pStyle w:val="Compact"/>
-        <w:numPr>
-          <w:ilvl w:val="0"/>
-          <w:numId w:val="1009"/>
-        </w:numPr>
-      </w:pPr>
+        <w:t xml:space="preserve">Headline comparison: TEAA (42.2% success, N=166) vs. static-script/Cypress baseline (15.4%, N=169)</w:t>
+      </w:r>
+      <w:r>
+        <w:t xml:space="preserve"> </w:t>
+      </w:r>
+      <w:r>
+        <w:t xml:space="preserve">on the same live FullTeaching SUT.</w:t>
+      </w:r>
+      <w:r>
+        <w:t xml:space="preserve"> </w:t>
+      </w:r>
+      <w:r>
+        <w:t xml:space="preserve">-</w:t>
+      </w:r>
+      <w:r>
+        <w:t xml:space="preserve"> </w:t>
+      </w:r>
       <w:r>
         <w:rPr>
           <w:b/>
@@ -10912,7 +12154,105 @@
         <w:t xml:space="preserve"> </w:t>
       </w:r>
       <w:r>
-        <w:t xml:space="preserve">Execution: success rate by action type (done ~69%, click ~33%, input ~26%, upload 50%).</w:t>
+        <w:t xml:space="preserve">Failure-mode attribution for each paradigm — static script: 78% plain failures (brittle</w:t>
+      </w:r>
+      <w:r>
+        <w:t xml:space="preserve"> </w:t>
+      </w:r>
+      <w:r>
+        <w:t xml:space="preserve">selectors/race conditions); TEAA: 37% web/DOM failures + 21% LLM reasoning failures.</w:t>
+      </w:r>
+      <w:r>
+        <w:t xml:space="preserve"> </w:t>
+      </w:r>
+      <w:r>
+        <w:t xml:space="preserve">-</w:t>
+      </w:r>
+      <w:r>
+        <w:t xml:space="preserve"> </w:t>
+      </w:r>
+      <w:r>
+        <w:rPr>
+          <w:b/>
+          <w:bCs/>
+        </w:rPr>
+        <w:t xml:space="preserve">F7</w:t>
+      </w:r>
+      <w:r>
+        <w:t xml:space="preserve"> </w:t>
+      </w:r>
+      <w:r>
+        <w:t xml:space="preserve">TEAA success rate by browser-action type —</w:t>
+      </w:r>
+      <w:r>
+        <w:t xml:space="preserve"> </w:t>
+      </w:r>
+      <w:r>
+        <w:rPr>
+          <w:rStyle w:val="VerbatimChar"/>
+        </w:rPr>
+        <w:t xml:space="preserve">done</w:t>
+      </w:r>
+      <w:r>
+        <w:t xml:space="preserve"> </w:t>
+      </w:r>
+      <w:r>
+        <w:t xml:space="preserve">69% vs. </w:t>
+      </w:r>
+      <w:r>
+        <w:rPr>
+          <w:rStyle w:val="VerbatimChar"/>
+        </w:rPr>
+        <w:t xml:space="preserve">click</w:t>
+      </w:r>
+      <w:r>
+        <w:t xml:space="preserve"> </w:t>
+      </w:r>
+      <w:r>
+        <w:t xml:space="preserve">33% /</w:t>
+      </w:r>
+      <w:r>
+        <w:t xml:space="preserve"> </w:t>
+      </w:r>
+      <w:r>
+        <w:rPr>
+          <w:rStyle w:val="VerbatimChar"/>
+        </w:rPr>
+        <w:t xml:space="preserve">input</w:t>
+      </w:r>
+      <w:r>
+        <w:t xml:space="preserve"> </w:t>
+      </w:r>
+      <w:r>
+        <w:t xml:space="preserve">26%, localizing the</w:t>
+      </w:r>
+      <w:r>
+        <w:t xml:space="preserve"> </w:t>
+      </w:r>
+      <w:r>
+        <w:t xml:space="preserve">agent’s weakness to selector grounding, not decision-making.</w:t>
+      </w:r>
+      <w:r>
+        <w:t xml:space="preserve"> </w:t>
+      </w:r>
+      <w:r>
+        <w:t xml:space="preserve">-</w:t>
+      </w:r>
+      <w:r>
+        <w:t xml:space="preserve"> </w:t>
+      </w:r>
+      <w:r>
+        <w:rPr>
+          <w:b/>
+          <w:bCs/>
+        </w:rPr>
+        <w:t xml:space="preserve">F8</w:t>
+      </w:r>
+      <w:r>
+        <w:t xml:space="preserve"> </w:t>
+      </w:r>
+      <w:r>
+        <w:t xml:space="preserve">TEAA pass/fail by business process (BP1 carries 132/166 of all executed cases).</w:t>
       </w:r>
     </w:p>
     <w:bookmarkEnd w:id="35"/>
@@ -11531,7 +12871,34 @@
     </w:lvlOverride>
   </w:num>
   <w:num w:numId="1008">
-    <w:abstractNumId w:val="991"/>
+    <w:abstractNumId w:val="99411"/>
+    <w:lvlOverride w:ilvl="0">
+      <w:startOverride w:val="1"/>
+    </w:lvlOverride>
+    <w:lvlOverride w:ilvl="1">
+      <w:startOverride w:val="1"/>
+    </w:lvlOverride>
+    <w:lvlOverride w:ilvl="2">
+      <w:startOverride w:val="1"/>
+    </w:lvlOverride>
+    <w:lvlOverride w:ilvl="3">
+      <w:startOverride w:val="1"/>
+    </w:lvlOverride>
+    <w:lvlOverride w:ilvl="4">
+      <w:startOverride w:val="1"/>
+    </w:lvlOverride>
+    <w:lvlOverride w:ilvl="5">
+      <w:startOverride w:val="1"/>
+    </w:lvlOverride>
+    <w:lvlOverride w:ilvl="6">
+      <w:startOverride w:val="1"/>
+    </w:lvlOverride>
+    <w:lvlOverride w:ilvl="7">
+      <w:startOverride w:val="1"/>
+    </w:lvlOverride>
+    <w:lvlOverride w:ilvl="8">
+      <w:startOverride w:val="1"/>
+    </w:lvlOverride>
   </w:num>
   <w:num w:numId="1009">
     <w:abstractNumId w:val="991"/>

</xml_diff>